<commit_message>
Add the Oct 5 tape and the power bottleneck to the main flow
The 5.34% long bond still left the Nasdaq at a high, power delays new orders rather than ending AI demand, and Korea filled the holiday gap in KOSDAQ names rather than Samsung and Hynix.

Co-authored-by: choijunh-cloud <choijunh-cloud@users.noreply.github.com>
</commit_message>
<xml_diff>
--- a/lectures/10월 2일 큰 흐름.docx
+++ b/lectures/10월 2일 큰 흐름.docx
@@ -15,7 +15,7 @@
           <w:color w:val="4B5563"/>
           <w:sz w:val="21"/>
         </w:rPr>
-        <w:t>2026. 10. 2. 종가  ·  큰 흐름</w:t>
+        <w:t>2026. 10. 2–6.  ·  큰 흐름</w:t>
       </w:r>
     </w:p>
     <w:p>
@@ -31,7 +31,7 @@
           <w:color w:val="B8943A"/>
           <w:sz w:val="26"/>
         </w:rPr>
-        <w:t>금리 천장  ·  AI 체인  ·  피크 이후</w:t>
+        <w:t>금리 천장  ·  전력의 속도  ·  AI 체인</w:t>
       </w:r>
     </w:p>
     <w:p>
@@ -106,7 +106,7 @@
                 <w:color w:val="1A1A1A"/>
                 <w:sz w:val="21"/>
               </w:rPr>
-              <w:t>지수는 10년물 5%대가 막고, 돈은 GPU를 지나 메모리·기판·광·전력으로 퍼지고 있다.</w:t>
+              <w:t>10월 5일에도 10년물은 5.34%인데 나스닥은 사상 최고다. 천장은 그대로다.</w:t>
             </w:r>
           </w:p>
           <w:p>
@@ -121,7 +121,22 @@
                 <w:color w:val="1A1A1A"/>
                 <w:sz w:val="21"/>
               </w:rPr>
-              <w:t>메모리 주가의 싸움은 피크가 오느냐가 아니라, 피크 이후 이익을 몇 배에 사느냐다.</w:t>
+              <w:t>전력은 수요를 끄지 않는다. 데이터센터가 서는 속도를 늦추고, 메모리·광의 신규 주문도 그 속도로 늦어진다.</w:t>
+            </w:r>
+          </w:p>
+          <w:p>
+            <w:pPr>
+              <w:spacing w:after="20" w:before="0" w:line="276" w:lineRule="auto"/>
+            </w:pPr>
+            <w:r>
+              <w:rPr>
+                <w:rFonts w:ascii="맑은 고딕" w:hAnsi="맑은 고딕" w:eastAsia="맑은 고딕"/>
+                <w:b w:val="0"/>
+                <w:i w:val="0"/>
+                <w:color w:val="1A1A1A"/>
+                <w:sz w:val="21"/>
+              </w:rPr>
+              <w:t>한국은 미국 갭을 삼전·닉스가 아니라 코스닥이 메웠다. 대형주는 들고, 추격 비중은 싣지 않는다.</w:t>
             </w:r>
           </w:p>
         </w:tc>
@@ -165,7 +180,27 @@
           <w:color w:val="0F2043"/>
           <w:sz w:val="22"/>
         </w:rPr>
-        <w:t>AI 캡엑스 확산</w:t>
+        <w:t>전력의 속도</w:t>
+      </w:r>
+      <w:r>
+        <w:rPr>
+          <w:rFonts w:ascii="맑은 고딕" w:hAnsi="맑은 고딕" w:eastAsia="맑은 고딕"/>
+          <w:b/>
+          <w:i w:val="0"/>
+          <w:color w:val="B8943A"/>
+          <w:sz w:val="22"/>
+        </w:rPr>
+        <w:t xml:space="preserve">   →   </w:t>
+      </w:r>
+      <w:r>
+        <w:rPr>
+          <w:rFonts w:ascii="맑은 고딕" w:hAnsi="맑은 고딕" w:eastAsia="맑은 고딕"/>
+          <w:b/>
+          <w:i w:val="0"/>
+          <w:color w:val="0F2043"/>
+          <w:sz w:val="22"/>
+        </w:rPr>
+        <w:t>체인 뒤로</w:t>
       </w:r>
       <w:r>
         <w:rPr>
@@ -213,7 +248,7 @@
           <w:color w:val="0F2043"/>
           <w:sz w:val="32"/>
         </w:rPr>
-        <w:t>세 층</w:t>
+        <w:t>지금 지도</w:t>
       </w:r>
     </w:p>
     <w:tbl>
@@ -386,7 +421,7 @@
                 <w:color w:val="1A1A1A"/>
                 <w:sz w:val="19"/>
               </w:rPr>
-              <w:t>고용은 둔화, 주식은 상승, 10년물은 5.28%</w:t>
+              <w:t>10/5 10년물 5.34%, 나스닥은 사상 최고</w:t>
             </w:r>
           </w:p>
         </w:tc>
@@ -449,7 +484,7 @@
                 <w:color w:val="1A1A1A"/>
                 <w:sz w:val="19"/>
               </w:rPr>
-              <w:t>체인</w:t>
+              <w:t>속도</w:t>
             </w:r>
           </w:p>
         </w:tc>
@@ -478,7 +513,7 @@
                 <w:color w:val="1A1A1A"/>
                 <w:sz w:val="19"/>
               </w:rPr>
-              <w:t>GPU 다음이 HBM, 기판, 광, 전력</w:t>
+              <w:t>전력 부족은 데이터센터 착공을 늦춘다</w:t>
             </w:r>
           </w:p>
         </w:tc>
@@ -507,7 +542,7 @@
                 <w:color w:val="1A1A1A"/>
                 <w:sz w:val="19"/>
               </w:rPr>
-              <w:t>AI 50~60%. 삼전·닉스가 핵</w:t>
+              <w:t>가장 빨리 MW를 붙이는 전원</w:t>
             </w:r>
           </w:p>
         </w:tc>
@@ -541,7 +576,7 @@
                 <w:color w:val="1A1A1A"/>
                 <w:sz w:val="19"/>
               </w:rPr>
-              <w:t>가격</w:t>
+              <w:t>체인</w:t>
             </w:r>
           </w:p>
         </w:tc>
@@ -570,7 +605,7 @@
                 <w:color w:val="1A1A1A"/>
                 <w:sz w:val="19"/>
               </w:rPr>
-              <w:t>메모리 100→122→90. 이익은 60조대에 남는가</w:t>
+              <w:t>늦어진 주문의 뒤가 메모리·광·기판</w:t>
             </w:r>
           </w:p>
         </w:tc>
@@ -599,7 +634,99 @@
                 <w:color w:val="1A1A1A"/>
                 <w:sz w:val="19"/>
               </w:rPr>
-              <w:t>8배가 열려야 224만원</w:t>
+              <w:t>AI 50~60%. 삼전·닉스는 유지</w:t>
+            </w:r>
+          </w:p>
+        </w:tc>
+      </w:tr>
+      <w:tr>
+        <w:trPr>
+          <w:cantSplit/>
+        </w:trPr>
+        <w:tc>
+          <w:tcPr>
+            <w:tcW w:type="dxa" w:w="1247"/>
+            <w:shd w:val="clear" w:color="auto" w:fill="F7F9FC"/>
+            <w:tcMar>
+              <w:top w:w="60" w:type="dxa"/>
+              <w:left w:w="80" w:type="dxa"/>
+              <w:bottom w:w="60" w:type="dxa"/>
+              <w:right w:w="80" w:type="dxa"/>
+            </w:tcMar>
+          </w:tcPr>
+          <w:p>
+            <w:pPr>
+              <w:spacing w:before="0" w:after="0" w:line="269" w:lineRule="auto"/>
+              <w:jc w:val="left"/>
+            </w:pPr>
+            <w:r/>
+            <w:r>
+              <w:rPr>
+                <w:rFonts w:ascii="맑은 고딕" w:hAnsi="맑은 고딕" w:eastAsia="맑은 고딕"/>
+                <w:b/>
+                <w:i w:val="0"/>
+                <w:color w:val="1A1A1A"/>
+                <w:sz w:val="19"/>
+              </w:rPr>
+              <w:t>수급</w:t>
+            </w:r>
+          </w:p>
+        </w:tc>
+        <w:tc>
+          <w:tcPr>
+            <w:tcW w:type="dxa" w:w="4876"/>
+            <w:shd w:val="clear" w:color="auto" w:fill="F7F9FC"/>
+            <w:tcMar>
+              <w:top w:w="60" w:type="dxa"/>
+              <w:left w:w="80" w:type="dxa"/>
+              <w:bottom w:w="60" w:type="dxa"/>
+              <w:right w:w="80" w:type="dxa"/>
+            </w:tcMar>
+          </w:tcPr>
+          <w:p>
+            <w:pPr>
+              <w:spacing w:before="0" w:after="0" w:line="269" w:lineRule="auto"/>
+              <w:jc w:val="center"/>
+            </w:pPr>
+            <w:r/>
+            <w:r>
+              <w:rPr>
+                <w:rFonts w:ascii="맑은 고딕" w:hAnsi="맑은 고딕" w:eastAsia="맑은 고딕"/>
+                <w:b w:val="0"/>
+                <w:i w:val="0"/>
+                <w:color w:val="1A1A1A"/>
+                <w:sz w:val="19"/>
+              </w:rPr>
+              <w:t>연휴 직후 코스닥 +2.9%, 코스피 −0.9%</w:t>
+            </w:r>
+          </w:p>
+        </w:tc>
+        <w:tc>
+          <w:tcPr>
+            <w:tcW w:type="dxa" w:w="3855"/>
+            <w:shd w:val="clear" w:color="auto" w:fill="F7F9FC"/>
+            <w:tcMar>
+              <w:top w:w="60" w:type="dxa"/>
+              <w:left w:w="80" w:type="dxa"/>
+              <w:bottom w:w="60" w:type="dxa"/>
+              <w:right w:w="80" w:type="dxa"/>
+            </w:tcMar>
+          </w:tcPr>
+          <w:p>
+            <w:pPr>
+              <w:spacing w:before="0" w:after="0" w:line="269" w:lineRule="auto"/>
+              <w:jc w:val="center"/>
+            </w:pPr>
+            <w:r/>
+            <w:r>
+              <w:rPr>
+                <w:rFonts w:ascii="맑은 고딕" w:hAnsi="맑은 고딕" w:eastAsia="맑은 고딕"/>
+                <w:b w:val="0"/>
+                <w:i w:val="0"/>
+                <w:color w:val="1A1A1A"/>
+                <w:sz w:val="19"/>
+              </w:rPr>
+              <w:t>대형주 교체 매매는 하지 않음</w:t>
             </w:r>
           </w:p>
         </w:tc>
@@ -623,7 +750,7 @@
           <w:color w:val="1A1A1A"/>
           <w:sz w:val="22"/>
         </w:rPr>
-        <w:t>27년 3월까지는 이 세 층이 계단으로 움직인다고 보고, 10년물이 5% 아래로 추세적으로 내려올 때 폭을 키운다.</w:t>
+        <w:t>27년 3월까지는 계단으로 보고, 10년물이 5% 아래로 추세적으로 내려올 때 폭을 키운다.</w:t>
       </w:r>
     </w:p>
     <w:p>
@@ -769,6 +896,69 @@
     </w:p>
     <w:p>
       <w:pPr>
+        <w:spacing w:before="200" w:after="80"/>
+      </w:pPr>
+      <w:r>
+        <w:rPr>
+          <w:rFonts w:ascii="맑은 고딕" w:hAnsi="맑은 고딕" w:eastAsia="맑은 고딕"/>
+          <w:b/>
+          <w:i w:val="0"/>
+          <w:color w:val="1E407C"/>
+          <w:sz w:val="26"/>
+        </w:rPr>
+        <w:t>10월 5일, 천장은 더 높아졌는데 성장주는 최고가다</w:t>
+      </w:r>
+    </w:p>
+    <w:p>
+      <w:pPr>
+        <w:spacing w:after="120" w:before="0" w:line="283" w:lineRule="auto"/>
+        <w:jc w:val="left"/>
+      </w:pPr>
+      <w:r>
+        <w:rPr>
+          <w:rFonts w:ascii="맑은 고딕" w:hAnsi="맑은 고딕" w:eastAsia="맑은 고딕"/>
+          <w:b w:val="0"/>
+          <w:i w:val="0"/>
+          <w:color w:val="1A1A1A"/>
+          <w:sz w:val="22"/>
+        </w:rPr>
+        <w:t>10년물 5.34%에서 나스닥은 +1.05%로 사상 최고, SOX는 +0.28%다. 10월 인상 확률은 70%에서 24%로 내려왔고, 유가 하락이 장기금리의 일부를 상쇄했다. 엔비디아 +2.1%, 브로드컴 +2.1%, TSMC +2.8%. 시장의 중심은 금리 레벨에서 3분기 AI 이익이 그 금리를 버티느냐로 옮겨 갔다.</w:t>
+      </w:r>
+    </w:p>
+    <w:p>
+      <w:pPr>
+        <w:spacing w:after="120" w:before="0" w:line="283" w:lineRule="auto"/>
+        <w:jc w:val="left"/>
+      </w:pPr>
+      <w:r>
+        <w:rPr>
+          <w:rFonts w:ascii="맑은 고딕" w:hAnsi="맑은 고딕" w:eastAsia="맑은 고딕"/>
+          <w:b w:val="0"/>
+          <w:i w:val="0"/>
+          <w:color w:val="1A1A1A"/>
+          <w:sz w:val="22"/>
+        </w:rPr>
+        <w:t>가장 강한 이름은 스페이스X다. 10월 2일 +7.4%에 이어 10월 5일 +7.6%다. 스타십 메탄을 위해 케이프 커내버럴에 52km, 16인치 천연가스 배관을 직접 깔고, 텍사스에도 같은 인프라와 가스 트레이더를 둔다. 발사 횟수가 가스·전력·인프라 수요로 번지는 자리다. 머스크는 TSMC 테라팹을 ‘논의 중’이라고 확인했다. 인텔은 장중 약 −2%였고, 구조는 인텔 선단 로직과 TSMC 운영·패키징이 같이 가는 멀티 파운드리다.</w:t>
+      </w:r>
+    </w:p>
+    <w:p>
+      <w:pPr>
+        <w:spacing w:after="120" w:before="0" w:line="283" w:lineRule="auto"/>
+        <w:jc w:val="left"/>
+      </w:pPr>
+      <w:r>
+        <w:rPr>
+          <w:rFonts w:ascii="맑은 고딕" w:hAnsi="맑은 고딕" w:eastAsia="맑은 고딕"/>
+          <w:b w:val="0"/>
+          <w:i w:val="0"/>
+          <w:color w:val="1A1A1A"/>
+          <w:sz w:val="22"/>
+        </w:rPr>
+        <w:t>HDD는 금요일 −10%의 절반을 되돌렸다. 웨스턴디지털 +6.4%, 시게이트 +4.5%. 마이크론 −1.0%, 샌디스크 −0.9%로 메모리는 상대적으로 약했다. 배수가 이미 20배대인 HDD와, 한 자릿수인 메모리는 같은 하락이 아니다.</w:t>
+      </w:r>
+    </w:p>
+    <w:p>
+      <w:pPr>
         <w:spacing w:before="280" w:after="160" w:line="264" w:lineRule="auto"/>
         <w:pBdr>
           <w:bottom w:val="single" w:sz="12" w:space="4" w:color="0F2043"/>
@@ -783,6 +973,418 @@
           <w:sz w:val="32"/>
         </w:rPr>
         <w:t xml:space="preserve">3.  </w:t>
+      </w:r>
+      <w:r>
+        <w:rPr>
+          <w:rFonts w:ascii="맑은 고딕" w:hAnsi="맑은 고딕" w:eastAsia="맑은 고딕"/>
+          <w:b/>
+          <w:i w:val="0"/>
+          <w:color w:val="0F2043"/>
+          <w:sz w:val="32"/>
+        </w:rPr>
+        <w:t>전력은 수요가 아니라 속도다</w:t>
+      </w:r>
+    </w:p>
+    <w:tbl>
+      <w:tblPr>
+        <w:tblW w:type="auto" w:w="0"/>
+        <w:jc w:val="center"/>
+        <w:tblLayout w:type="autofit"/>
+        <w:tblLook w:firstColumn="1" w:firstRow="1" w:lastColumn="0" w:lastRow="0" w:noHBand="0" w:noVBand="1" w:val="04A0"/>
+      </w:tblPr>
+      <w:tblGrid>
+        <w:gridCol w:w="10092"/>
+      </w:tblGrid>
+      <w:tr>
+        <w:tc>
+          <w:tcPr>
+            <w:tcW w:type="dxa" w:w="10092"/>
+            <w:shd w:val="clear" w:color="auto" w:fill="EEF2F8"/>
+            <w:tcBorders>
+              <w:top w:val="nil"/>
+              <w:left w:val="single" w:sz="28" w:space="0" w:color="0F2043"/>
+              <w:bottom w:val="nil"/>
+              <w:right w:val="nil"/>
+            </w:tcBorders>
+            <w:tcMar>
+              <w:top w:w="80" w:type="dxa"/>
+              <w:left w:w="120" w:type="dxa"/>
+              <w:bottom w:w="80" w:type="dxa"/>
+              <w:right w:w="120" w:type="dxa"/>
+            </w:tcMar>
+          </w:tcPr>
+          <w:p>
+            <w:pPr>
+              <w:spacing w:after="40" w:before="0"/>
+            </w:pPr>
+            <w:r/>
+            <w:r>
+              <w:rPr>
+                <w:rFonts w:ascii="맑은 고딕" w:hAnsi="맑은 고딕" w:eastAsia="맑은 고딕"/>
+                <w:b/>
+                <w:i w:val="0"/>
+                <w:color w:val="0F2043"/>
+                <w:sz w:val="20"/>
+              </w:rPr>
+              <w:t>한 줄</w:t>
+            </w:r>
+          </w:p>
+          <w:p>
+            <w:pPr>
+              <w:spacing w:after="20" w:before="0" w:line="276" w:lineRule="auto"/>
+            </w:pPr>
+            <w:r>
+              <w:rPr>
+                <w:rFonts w:ascii="맑은 고딕" w:hAnsi="맑은 고딕" w:eastAsia="맑은 고딕"/>
+                <w:b w:val="0"/>
+                <w:i w:val="0"/>
+                <w:color w:val="1A1A1A"/>
+                <w:sz w:val="21"/>
+              </w:rPr>
+              <w:t>모건스탠리의 사슬은 이렇다. 전력 부족 → 데이터센터 가동 지연 → AI 서버 설치 지연 → 신규 가속기와 HBM 주문의 시점 조정.</w:t>
+            </w:r>
+          </w:p>
+          <w:p>
+            <w:pPr>
+              <w:spacing w:after="20" w:before="0" w:line="276" w:lineRule="auto"/>
+            </w:pPr>
+            <w:r>
+              <w:rPr>
+                <w:rFonts w:ascii="맑은 고딕" w:hAnsi="맑은 고딕" w:eastAsia="맑은 고딕"/>
+                <w:b w:val="0"/>
+                <w:i w:val="0"/>
+                <w:color w:val="1A1A1A"/>
+                <w:sz w:val="21"/>
+              </w:rPr>
+              <w:t>엔비디아·브로드컴의 2027년은 이미 잡힌 물량이라 덜 다친다. 메모리, 광, 전력관리, 아날로그는 데이터센터가 실제로 서는 사이클을 더 탄다.</w:t>
+            </w:r>
+          </w:p>
+        </w:tc>
+      </w:tr>
+    </w:tbl>
+    <w:p>
+      <w:pPr>
+        <w:spacing w:after="120"/>
+      </w:pPr>
+    </w:p>
+    <w:p>
+      <w:pPr>
+        <w:spacing w:after="120" w:before="0" w:line="283" w:lineRule="auto"/>
+        <w:jc w:val="left"/>
+      </w:pPr>
+      <w:r>
+        <w:rPr>
+          <w:rFonts w:ascii="맑은 고딕" w:hAnsi="맑은 고딕" w:eastAsia="맑은 고딕"/>
+          <w:b w:val="0"/>
+          <w:i w:val="0"/>
+          <w:color w:val="1A1A1A"/>
+          <w:sz w:val="22"/>
+        </w:rPr>
+        <w:t>구글이 2027년 데이터센터의 전력을 못 구하면 가동이 6개월에서 1년 밀리고, TPU 일정이 밀리며, 브로드컴의 다음 ASIC과 그에 붙는 HBM이 같이 조정된다. 이미 확정된 물량은 상대적으로 안전하고, 앞으로 새로 잡는 물량은 GPU와 HBM이 같이 위험하다. 방송은 이 노트를 2028년까지 미국 데이터센터 전력의 약 34% 부족으로 옮겼다.</w:t>
+      </w:r>
+    </w:p>
+    <w:p>
+      <w:pPr>
+        <w:spacing w:after="120" w:before="0" w:line="283" w:lineRule="auto"/>
+        <w:jc w:val="left"/>
+      </w:pPr>
+      <w:r>
+        <w:rPr>
+          <w:rFonts w:ascii="맑은 고딕" w:hAnsi="맑은 고딕" w:eastAsia="맑은 고딕"/>
+          <w:b w:val="0"/>
+          <w:i w:val="0"/>
+          <w:color w:val="1A1A1A"/>
+          <w:sz w:val="22"/>
+        </w:rPr>
+        <w:t>그래서 해법의 1순위는 가장 깨끗한 전기가 아니다. 가장 빨리 메가와트를 붙이는 전기다. 입지 경쟁의 단위는 Time-to-Power, 전력까지 걸리는 시간이다. 데이터센터는 송전망 접속을 기다리지 않고 부지 안 발전을 고른다. 미국에서는 GE버노바의 항공용 가스터빈, 배터리 하이브리드, 그리드 연결이 가장 직접적이다. 지멘스에너지도 소형 가스터빈 수요를 같이 받는다. 국내에서는 산일전기가 변압기 앞줄이고, 두산에너빌리티는 원전 이전에 가스·증기 터빈이 먼저 팔린다. HVM은 스페이스X용 내열 합금에 더해, 터빈 소재 테스트가 2027년 초에 나오면 가스터빈 쪽 노출이 붙는다.</w:t>
+      </w:r>
+    </w:p>
+    <w:tbl>
+      <w:tblPr>
+        <w:tblW w:type="auto" w:w="0"/>
+        <w:jc w:val="center"/>
+        <w:tblLayout w:type="autofit"/>
+        <w:tblLook w:firstColumn="1" w:firstRow="1" w:lastColumn="0" w:lastRow="0" w:noHBand="0" w:noVBand="1" w:val="04A0"/>
+      </w:tblPr>
+      <w:tblGrid>
+        <w:gridCol w:w="10092"/>
+      </w:tblGrid>
+      <w:tr>
+        <w:tc>
+          <w:tcPr>
+            <w:tcW w:type="dxa" w:w="10092"/>
+            <w:shd w:val="clear" w:color="auto" w:fill="FFF8E7"/>
+            <w:tcBorders>
+              <w:top w:val="nil"/>
+              <w:left w:val="single" w:sz="28" w:space="0" w:color="B8943A"/>
+              <w:bottom w:val="nil"/>
+              <w:right w:val="nil"/>
+            </w:tcBorders>
+            <w:tcMar>
+              <w:top w:w="80" w:type="dxa"/>
+              <w:left w:w="120" w:type="dxa"/>
+              <w:bottom w:w="80" w:type="dxa"/>
+              <w:right w:w="120" w:type="dxa"/>
+            </w:tcMar>
+          </w:tcPr>
+          <w:p>
+            <w:pPr>
+              <w:spacing w:after="40" w:before="0"/>
+            </w:pPr>
+            <w:r/>
+            <w:r>
+              <w:rPr>
+                <w:rFonts w:ascii="맑은 고딕" w:hAnsi="맑은 고딕" w:eastAsia="맑은 고딕"/>
+                <w:b/>
+                <w:i w:val="0"/>
+                <w:color w:val="7A5C12"/>
+                <w:sz w:val="20"/>
+              </w:rPr>
+              <w:t>그날 주가가 말해 준 것</w:t>
+            </w:r>
+          </w:p>
+          <w:p>
+            <w:pPr>
+              <w:spacing w:after="20" w:before="0" w:line="276" w:lineRule="auto"/>
+            </w:pPr>
+            <w:r>
+              <w:rPr>
+                <w:rFonts w:ascii="맑은 고딕" w:hAnsi="맑은 고딕" w:eastAsia="맑은 고딕"/>
+                <w:b w:val="0"/>
+                <w:i w:val="0"/>
+                <w:color w:val="1A1A1A"/>
+                <w:sz w:val="21"/>
+              </w:rPr>
+              <w:t>정말로 새로운 충격이었다면 GE버노바, 캐터필러, 베이커휴스, 블룸에너지, 윌리엄스가 먼저 뛰어야 했다. 그날은 거의 시장만큼이었고, 원전인 컨스텔레이션과 비스트라가 3~4%로 더 움직였다.</w:t>
+            </w:r>
+          </w:p>
+          <w:p>
+            <w:pPr>
+              <w:spacing w:after="20" w:before="0" w:line="276" w:lineRule="auto"/>
+            </w:pPr>
+            <w:r>
+              <w:rPr>
+                <w:rFonts w:ascii="맑은 고딕" w:hAnsi="맑은 고딕" w:eastAsia="맑은 고딕"/>
+                <w:b w:val="0"/>
+                <w:i w:val="0"/>
+                <w:color w:val="1A1A1A"/>
+                <w:sz w:val="21"/>
+              </w:rPr>
+              <w:t>엔비디아는 이미 내년 성장을 100%가 아니라 70%로 말하면서 메모리와 전력을 조건으로 달아 두었다. 34% 부족의 상당 부분은 시장이 알고 있던 제약이다.</w:t>
+            </w:r>
+          </w:p>
+          <w:p>
+            <w:pPr>
+              <w:spacing w:after="20" w:before="0" w:line="276" w:lineRule="auto"/>
+            </w:pPr>
+            <w:r>
+              <w:rPr>
+                <w:rFonts w:ascii="맑은 고딕" w:hAnsi="맑은 고딕" w:eastAsia="맑은 고딕"/>
+                <w:b w:val="0"/>
+                <w:i w:val="0"/>
+                <w:color w:val="1A1A1A"/>
+                <w:sz w:val="21"/>
+              </w:rPr>
+              <w:t>전력은 체인을 버리는 이유가 아니다. 후방 주문이 언제부터 늦어지는지를 보는 속도계이고, 한국에서는 대형주에서 소부장으로 수급이 옮겨 간 핑계로도 쓰였다.</w:t>
+            </w:r>
+          </w:p>
+        </w:tc>
+      </w:tr>
+    </w:tbl>
+    <w:p>
+      <w:pPr>
+        <w:spacing w:after="120"/>
+      </w:pPr>
+    </w:p>
+    <w:p>
+      <w:pPr>
+        <w:spacing w:before="280" w:after="160" w:line="264" w:lineRule="auto"/>
+        <w:pBdr>
+          <w:bottom w:val="single" w:sz="12" w:space="4" w:color="0F2043"/>
+        </w:pBdr>
+      </w:pPr>
+      <w:r>
+        <w:rPr>
+          <w:rFonts w:ascii="맑은 고딕" w:hAnsi="맑은 고딕" w:eastAsia="맑은 고딕"/>
+          <w:b/>
+          <w:i w:val="0"/>
+          <w:color w:val="B8943A"/>
+          <w:sz w:val="32"/>
+        </w:rPr>
+        <w:t xml:space="preserve">4.  </w:t>
+      </w:r>
+      <w:r>
+        <w:rPr>
+          <w:rFonts w:ascii="맑은 고딕" w:hAnsi="맑은 고딕" w:eastAsia="맑은 고딕"/>
+          <w:b/>
+          <w:i w:val="0"/>
+          <w:color w:val="0F2043"/>
+          <w:sz w:val="32"/>
+        </w:rPr>
+        <w:t>한국은 갭을 코스닥이 메웠다</w:t>
+      </w:r>
+    </w:p>
+    <w:p>
+      <w:pPr>
+        <w:spacing w:after="120" w:before="0" w:line="283" w:lineRule="auto"/>
+        <w:jc w:val="left"/>
+      </w:pPr>
+      <w:r>
+        <w:rPr>
+          <w:rFonts w:ascii="맑은 고딕" w:hAnsi="맑은 고딕" w:eastAsia="맑은 고딕"/>
+          <w:b w:val="0"/>
+          <w:i w:val="0"/>
+          <w:color w:val="1A1A1A"/>
+          <w:sz w:val="22"/>
+        </w:rPr>
+        <w:t>연휴 직후 코스닥은 약 +2.9%, 코스피는 약 −0.9%다. 외국인은 현물을 약 1.7조 팔아 삼전·닉스를 눌렀고, 하이닉스는 약 −3.5%로 60일선과 170만원대를 앞두고 있다. 선물에서는 오후에 상당 부분을 되감아 방향은 중립에 가깝다. 매도는 멈춘 쪽에 가깝고, 살 자리는 아직 아니다.</w:t>
+      </w:r>
+    </w:p>
+    <w:p>
+      <w:pPr>
+        <w:spacing w:after="120" w:before="0" w:line="283" w:lineRule="auto"/>
+        <w:jc w:val="left"/>
+      </w:pPr>
+      <w:r>
+        <w:rPr>
+          <w:rFonts w:ascii="맑은 고딕" w:hAnsi="맑은 고딕" w:eastAsia="맑은 고딕"/>
+          <w:b w:val="0"/>
+          <w:i w:val="0"/>
+          <w:color w:val="1A1A1A"/>
+          <w:sz w:val="22"/>
+        </w:rPr>
+        <w:t>10월의 판은 코스닥과 소부장 쪽이다. 반도체 소부장과 2차전지는 예전에 서로 수급을 빼앗던 사이였고, 9월 이후 AI 밸류체인으로 같은 편이 됐다. 이날은 바이오와 로봇까지 돈이 들어왔다. 다만 주성엔지니어링 +17%, 에코프로BM +11%, HLB +16%, 삼천당제약 +19%처럼 시총 상위가 바스켓으로 당겨진 날이기도 하다. 소부장 ETF 리밸런싱은 8일께 끝난다. 따라붙는 비중은 계좌의 중심을 흔들 크기가 아니다.</w:t>
+      </w:r>
+    </w:p>
+    <w:p>
+      <w:pPr>
+        <w:spacing w:after="120" w:before="0" w:line="283" w:lineRule="auto"/>
+        <w:jc w:val="left"/>
+      </w:pPr>
+      <w:r>
+        <w:rPr>
+          <w:rFonts w:ascii="맑은 고딕" w:hAnsi="맑은 고딕" w:eastAsia="맑은 고딕"/>
+          <w:b w:val="0"/>
+          <w:i w:val="0"/>
+          <w:color w:val="1A1A1A"/>
+          <w:sz w:val="22"/>
+        </w:rPr>
+        <w:t>삼전·닉스를 팔고 갈아타는 자리는 아니다. 대형주가 무너지면 시장 바닥이 없다. 삼성 잠정 실적은 110조에서 106조 안팎으로 눈높이가 낮아졌고, 100조 아래는 아니라는 쪽이다. 주가 반응은 마이크론처럼 기록을 확인하고 조금 움직이는 쪽에 가깝다. 삼성의 자사주 매입은 끝났고, 하이닉스도 2~3주 안에 끝난다. 외국인이 한국을 파는 이유는 업황이 깨져서가 아니라, AI 인프라가 금리를 밀어 올릴 때 이머징이 먼저 팔리기 때문이다.</w:t>
+      </w:r>
+    </w:p>
+    <w:tbl>
+      <w:tblPr>
+        <w:tblW w:type="auto" w:w="0"/>
+        <w:jc w:val="center"/>
+        <w:tblLayout w:type="autofit"/>
+        <w:tblLook w:firstColumn="1" w:firstRow="1" w:lastColumn="0" w:lastRow="0" w:noHBand="0" w:noVBand="1" w:val="04A0"/>
+      </w:tblPr>
+      <w:tblGrid>
+        <w:gridCol w:w="10092"/>
+      </w:tblGrid>
+      <w:tr>
+        <w:tc>
+          <w:tcPr>
+            <w:tcW w:type="dxa" w:w="10092"/>
+            <w:shd w:val="clear" w:color="auto" w:fill="E8F1FB"/>
+            <w:tcBorders>
+              <w:top w:val="nil"/>
+              <w:left w:val="single" w:sz="28" w:space="0" w:color="1E407C"/>
+              <w:bottom w:val="nil"/>
+              <w:right w:val="nil"/>
+            </w:tcBorders>
+            <w:tcMar>
+              <w:top w:w="80" w:type="dxa"/>
+              <w:left w:w="120" w:type="dxa"/>
+              <w:bottom w:w="80" w:type="dxa"/>
+              <w:right w:w="120" w:type="dxa"/>
+            </w:tcMar>
+          </w:tcPr>
+          <w:p>
+            <w:pPr>
+              <w:spacing w:after="40" w:before="0"/>
+            </w:pPr>
+            <w:r/>
+            <w:r>
+              <w:rPr>
+                <w:rFonts w:ascii="맑은 고딕" w:hAnsi="맑은 고딕" w:eastAsia="맑은 고딕"/>
+                <w:b/>
+                <w:i w:val="0"/>
+                <w:color w:val="1E407C"/>
+                <w:sz w:val="20"/>
+              </w:rPr>
+              <w:t>10월에 보는 순서</w:t>
+            </w:r>
+          </w:p>
+          <w:p>
+            <w:pPr>
+              <w:spacing w:after="20" w:before="0" w:line="276" w:lineRule="auto"/>
+            </w:pPr>
+            <w:r>
+              <w:rPr>
+                <w:rFonts w:ascii="맑은 고딕" w:hAnsi="맑은 고딕" w:eastAsia="맑은 고딕"/>
+                <w:b w:val="0"/>
+                <w:i w:val="0"/>
+                <w:color w:val="1A1A1A"/>
+                <w:sz w:val="21"/>
+              </w:rPr>
+              <w:t>이번 주 삼성 잠정, 이어서 빅테크 실적. 금리 인상 확률은 10월과 12월 모두 내려 와 중소형에 우호적이다. 사우디 판매가격 인하로 유가의 급등 꼬리는 줄었다.</w:t>
+            </w:r>
+          </w:p>
+          <w:p>
+            <w:pPr>
+              <w:spacing w:after="20" w:before="0" w:line="276" w:lineRule="auto"/>
+            </w:pPr>
+            <w:r>
+              <w:rPr>
+                <w:rFonts w:ascii="맑은 고딕" w:hAnsi="맑은 고딕" w:eastAsia="맑은 고딕"/>
+                <w:b w:val="0"/>
+                <w:i w:val="0"/>
+                <w:color w:val="1A1A1A"/>
+                <w:sz w:val="21"/>
+              </w:rPr>
+              <w:t>외국인이 그날 산 자리는 삼성전기, 삼성SDI, LG전자, LG이노텍, 이수페타시스다. 기판과 4분기 실적, 액침 냉각이다. 이 실적 수급이 작은 이름으로 퍼지는지를 본다.</w:t>
+            </w:r>
+          </w:p>
+          <w:p>
+            <w:pPr>
+              <w:spacing w:after="20" w:before="0" w:line="276" w:lineRule="auto"/>
+            </w:pPr>
+            <w:r>
+              <w:rPr>
+                <w:rFonts w:ascii="맑은 고딕" w:hAnsi="맑은 고딕" w:eastAsia="맑은 고딕"/>
+                <w:b w:val="0"/>
+                <w:i w:val="0"/>
+                <w:color w:val="1A1A1A"/>
+                <w:sz w:val="21"/>
+              </w:rPr>
+              <w:t>코스피는 두 주 전과 같은 7,000 안팎이다. 연말 7,700은 여기서 10%라 쉽게 보지 않는다. 나눠 사고, 하루의 색으로 본진을 바꾸지 않는다.</w:t>
+            </w:r>
+          </w:p>
+        </w:tc>
+      </w:tr>
+    </w:tbl>
+    <w:p>
+      <w:pPr>
+        <w:spacing w:after="120"/>
+      </w:pPr>
+    </w:p>
+    <w:p>
+      <w:pPr>
+        <w:spacing w:before="280" w:after="160" w:line="264" w:lineRule="auto"/>
+        <w:pBdr>
+          <w:bottom w:val="single" w:sz="12" w:space="4" w:color="0F2043"/>
+        </w:pBdr>
+      </w:pPr>
+      <w:r>
+        <w:rPr>
+          <w:rFonts w:ascii="맑은 고딕" w:hAnsi="맑은 고딕" w:eastAsia="맑은 고딕"/>
+          <w:b/>
+          <w:i w:val="0"/>
+          <w:color w:val="B8943A"/>
+          <w:sz w:val="32"/>
+        </w:rPr>
+        <w:t xml:space="preserve">5.  </w:t>
       </w:r>
       <w:r>
         <w:rPr>
@@ -1577,7 +2179,7 @@
                 <w:color w:val="1A1A1A"/>
                 <w:sz w:val="19"/>
               </w:rPr>
-              <w:t>산일전기</w:t>
+              <w:t>GE버노바 · 산일전기 · 두산에너빌리티 · HVM</w:t>
             </w:r>
           </w:p>
         </w:tc>
@@ -1606,7 +2208,7 @@
                 <w:color w:val="1A1A1A"/>
                 <w:sz w:val="19"/>
               </w:rPr>
-              <w:t>변압기 중 앞. FY28 16배, 이익 증가가 매출보다 빠름</w:t>
+              <w:t>가장 빨리 MW. 터빈·변압기·내열 합금. 원전은 그 다음</w:t>
             </w:r>
           </w:p>
         </w:tc>
@@ -1832,7 +2434,7 @@
           <w:color w:val="B8943A"/>
           <w:sz w:val="32"/>
         </w:rPr>
-        <w:t xml:space="preserve">4.  </w:t>
+        <w:t xml:space="preserve">6.  </w:t>
       </w:r>
       <w:r>
         <w:rPr>
@@ -2409,7 +3011,7 @@
           <w:color w:val="B8943A"/>
           <w:sz w:val="32"/>
         </w:rPr>
-        <w:t xml:space="preserve">5.  </w:t>
+        <w:t xml:space="preserve">7.  </w:t>
       </w:r>
       <w:r>
         <w:rPr>
@@ -2621,7 +3223,7 @@
                 <w:color w:val="1A1A1A"/>
                 <w:sz w:val="19"/>
               </w:rPr>
-              <w:t>12월 인상 확률이 다시 산다</w:t>
+              <w:t>5.34%가 더 오르고 3분기 실적이 그 금리를 못 버팀</w:t>
             </w:r>
           </w:p>
         </w:tc>
@@ -2655,7 +3257,7 @@
                 <w:color w:val="1A1A1A"/>
                 <w:sz w:val="19"/>
               </w:rPr>
-              <w:t>메모리</w:t>
+              <w:t>전력</w:t>
             </w:r>
           </w:p>
         </w:tc>
@@ -2684,6 +3286,98 @@
                 <w:color w:val="1A1A1A"/>
                 <w:sz w:val="19"/>
               </w:rPr>
+              <w:t>신규 주문이 2027년 확정 물량 뒤에서만 밀림</w:t>
+            </w:r>
+          </w:p>
+        </w:tc>
+        <w:tc>
+          <w:tcPr>
+            <w:tcW w:type="dxa" w:w="4195"/>
+            <w:shd w:val="clear" w:color="auto" w:fill="F7F9FC"/>
+            <w:tcMar>
+              <w:top w:w="60" w:type="dxa"/>
+              <w:left w:w="80" w:type="dxa"/>
+              <w:bottom w:w="60" w:type="dxa"/>
+              <w:right w:w="80" w:type="dxa"/>
+            </w:tcMar>
+          </w:tcPr>
+          <w:p>
+            <w:pPr>
+              <w:spacing w:before="0" w:after="0" w:line="269" w:lineRule="auto"/>
+              <w:jc w:val="center"/>
+            </w:pPr>
+            <w:r/>
+            <w:r>
+              <w:rPr>
+                <w:rFonts w:ascii="맑은 고딕" w:hAnsi="맑은 고딕" w:eastAsia="맑은 고딕"/>
+                <w:b w:val="0"/>
+                <w:i w:val="0"/>
+                <w:color w:val="1A1A1A"/>
+                <w:sz w:val="19"/>
+              </w:rPr>
+              <w:t>착공 지연이 HBM·광의 신규 수주를 뒤로 밀기 시작</w:t>
+            </w:r>
+          </w:p>
+        </w:tc>
+      </w:tr>
+      <w:tr>
+        <w:trPr>
+          <w:cantSplit/>
+        </w:trPr>
+        <w:tc>
+          <w:tcPr>
+            <w:tcW w:type="dxa" w:w="1587"/>
+            <w:shd w:val="clear" w:color="auto" w:fill="FFFFFF"/>
+            <w:tcMar>
+              <w:top w:w="60" w:type="dxa"/>
+              <w:left w:w="80" w:type="dxa"/>
+              <w:bottom w:w="60" w:type="dxa"/>
+              <w:right w:w="80" w:type="dxa"/>
+            </w:tcMar>
+          </w:tcPr>
+          <w:p>
+            <w:pPr>
+              <w:spacing w:before="0" w:after="0" w:line="269" w:lineRule="auto"/>
+              <w:jc w:val="left"/>
+            </w:pPr>
+            <w:r/>
+            <w:r>
+              <w:rPr>
+                <w:rFonts w:ascii="맑은 고딕" w:hAnsi="맑은 고딕" w:eastAsia="맑은 고딕"/>
+                <w:b/>
+                <w:i w:val="0"/>
+                <w:color w:val="1A1A1A"/>
+                <w:sz w:val="19"/>
+              </w:rPr>
+              <w:t>메모리</w:t>
+            </w:r>
+          </w:p>
+        </w:tc>
+        <w:tc>
+          <w:tcPr>
+            <w:tcW w:type="dxa" w:w="4195"/>
+            <w:shd w:val="clear" w:color="auto" w:fill="FFFFFF"/>
+            <w:tcMar>
+              <w:top w:w="60" w:type="dxa"/>
+              <w:left w:w="80" w:type="dxa"/>
+              <w:bottom w:w="60" w:type="dxa"/>
+              <w:right w:w="80" w:type="dxa"/>
+            </w:tcMar>
+          </w:tcPr>
+          <w:p>
+            <w:pPr>
+              <w:spacing w:before="0" w:after="0" w:line="269" w:lineRule="auto"/>
+              <w:jc w:val="center"/>
+            </w:pPr>
+            <w:r/>
+            <w:r>
+              <w:rPr>
+                <w:rFonts w:ascii="맑은 고딕" w:hAnsi="맑은 고딕" w:eastAsia="맑은 고딕"/>
+                <w:b w:val="0"/>
+                <w:i w:val="0"/>
+                <w:color w:val="1A1A1A"/>
+                <w:sz w:val="19"/>
+              </w:rPr>
               <w:t>28년 분기 이익이 60조 위</w:t>
             </w:r>
           </w:p>
@@ -2691,7 +3385,7 @@
         <w:tc>
           <w:tcPr>
             <w:tcW w:type="dxa" w:w="4195"/>
-            <w:shd w:val="clear" w:color="auto" w:fill="F7F9FC"/>
+            <w:shd w:val="clear" w:color="auto" w:fill="FFFFFF"/>
             <w:tcMar>
               <w:top w:w="60" w:type="dxa"/>
               <w:left w:w="80" w:type="dxa"/>
@@ -2725,6 +3419,98 @@
         <w:tc>
           <w:tcPr>
             <w:tcW w:type="dxa" w:w="1587"/>
+            <w:shd w:val="clear" w:color="auto" w:fill="F7F9FC"/>
+            <w:tcMar>
+              <w:top w:w="60" w:type="dxa"/>
+              <w:left w:w="80" w:type="dxa"/>
+              <w:bottom w:w="60" w:type="dxa"/>
+              <w:right w:w="80" w:type="dxa"/>
+            </w:tcMar>
+          </w:tcPr>
+          <w:p>
+            <w:pPr>
+              <w:spacing w:before="0" w:after="0" w:line="269" w:lineRule="auto"/>
+              <w:jc w:val="left"/>
+            </w:pPr>
+            <w:r/>
+            <w:r>
+              <w:rPr>
+                <w:rFonts w:ascii="맑은 고딕" w:hAnsi="맑은 고딕" w:eastAsia="맑은 고딕"/>
+                <w:b/>
+                <w:i w:val="0"/>
+                <w:color w:val="1A1A1A"/>
+                <w:sz w:val="19"/>
+              </w:rPr>
+              <w:t>한국 수급</w:t>
+            </w:r>
+          </w:p>
+        </w:tc>
+        <w:tc>
+          <w:tcPr>
+            <w:tcW w:type="dxa" w:w="4195"/>
+            <w:shd w:val="clear" w:color="auto" w:fill="F7F9FC"/>
+            <w:tcMar>
+              <w:top w:w="60" w:type="dxa"/>
+              <w:left w:w="80" w:type="dxa"/>
+              <w:bottom w:w="60" w:type="dxa"/>
+              <w:right w:w="80" w:type="dxa"/>
+            </w:tcMar>
+          </w:tcPr>
+          <w:p>
+            <w:pPr>
+              <w:spacing w:before="0" w:after="0" w:line="269" w:lineRule="auto"/>
+              <w:jc w:val="center"/>
+            </w:pPr>
+            <w:r/>
+            <w:r>
+              <w:rPr>
+                <w:rFonts w:ascii="맑은 고딕" w:hAnsi="맑은 고딕" w:eastAsia="맑은 고딕"/>
+                <w:b w:val="0"/>
+                <w:i w:val="0"/>
+                <w:color w:val="1A1A1A"/>
+                <w:sz w:val="19"/>
+              </w:rPr>
+              <w:t>실적 섹터(기판·전기)로 외국인 매수가 퍼짐</w:t>
+            </w:r>
+          </w:p>
+        </w:tc>
+        <w:tc>
+          <w:tcPr>
+            <w:tcW w:type="dxa" w:w="4195"/>
+            <w:shd w:val="clear" w:color="auto" w:fill="F7F9FC"/>
+            <w:tcMar>
+              <w:top w:w="60" w:type="dxa"/>
+              <w:left w:w="80" w:type="dxa"/>
+              <w:bottom w:w="60" w:type="dxa"/>
+              <w:right w:w="80" w:type="dxa"/>
+            </w:tcMar>
+          </w:tcPr>
+          <w:p>
+            <w:pPr>
+              <w:spacing w:before="0" w:after="0" w:line="269" w:lineRule="auto"/>
+              <w:jc w:val="center"/>
+            </w:pPr>
+            <w:r/>
+            <w:r>
+              <w:rPr>
+                <w:rFonts w:ascii="맑은 고딕" w:hAnsi="맑은 고딕" w:eastAsia="맑은 고딕"/>
+                <w:b w:val="0"/>
+                <w:i w:val="0"/>
+                <w:color w:val="1A1A1A"/>
+                <w:sz w:val="19"/>
+              </w:rPr>
+              <w:t>코스닥 바스켓을 본진으로 갈아탐</w:t>
+            </w:r>
+          </w:p>
+        </w:tc>
+      </w:tr>
+      <w:tr>
+        <w:trPr>
+          <w:cantSplit/>
+        </w:trPr>
+        <w:tc>
+          <w:tcPr>
+            <w:tcW w:type="dxa" w:w="1587"/>
             <w:shd w:val="clear" w:color="auto" w:fill="FFFFFF"/>
             <w:tcMar>
               <w:top w:w="60" w:type="dxa"/>
@@ -2747,7 +3533,7 @@
                 <w:color w:val="1A1A1A"/>
                 <w:sz w:val="19"/>
               </w:rPr>
-              <w:t>광 · 두산</w:t>
+              <w:t>성호전자</w:t>
             </w:r>
           </w:p>
         </w:tc>
@@ -2776,7 +3562,7 @@
                 <w:color w:val="1A1A1A"/>
                 <w:sz w:val="19"/>
               </w:rPr>
-              <w:t>1.6T 배치와 CCL 매출이 같이 간다</w:t>
+              <w:t>111백만주가 확인되고 CPO 일정이 유지</w:t>
             </w:r>
           </w:p>
         </w:tc>
@@ -2805,7 +3591,7 @@
                 <w:color w:val="1A1A1A"/>
                 <w:sz w:val="19"/>
               </w:rPr>
-              <w:t>규제 헤드라인만으로 CCL을 판다</w:t>
+              <w:t>7만원, 또는 5~6만원을 30배 하단으로 말한다</w:t>
             </w:r>
           </w:p>
         </w:tc>
@@ -2839,7 +3625,7 @@
                 <w:color w:val="1A1A1A"/>
                 <w:sz w:val="19"/>
               </w:rPr>
-              <w:t>성호전자</w:t>
+              <w:t>HDD</w:t>
             </w:r>
           </w:p>
         </w:tc>
@@ -2868,7 +3654,7 @@
                 <w:color w:val="1A1A1A"/>
                 <w:sz w:val="19"/>
               </w:rPr>
-              <w:t>111백만주가 확인되고 CPO 일정이 유지</w:t>
+              <w:t>26·27년 계약 물량이 유지</w:t>
             </w:r>
           </w:p>
         </w:tc>
@@ -2897,7 +3683,7 @@
                 <w:color w:val="1A1A1A"/>
                 <w:sz w:val="19"/>
               </w:rPr>
-              <w:t>7만원, 또는 5~6만원을 30배 하단으로 말한다</w:t>
+              <w:t>니어라인 계약이 깨지거나 증설이 앞당겨진다</w:t>
             </w:r>
           </w:p>
         </w:tc>
@@ -2931,7 +3717,7 @@
                 <w:color w:val="1A1A1A"/>
                 <w:sz w:val="19"/>
               </w:rPr>
-              <w:t>HDD</w:t>
+              <w:t>수요 온도</w:t>
             </w:r>
           </w:p>
         </w:tc>
@@ -2960,7 +3746,7 @@
                 <w:color w:val="1A1A1A"/>
                 <w:sz w:val="19"/>
               </w:rPr>
-              <w:t>26·27년 계약 물량이 유지</w:t>
+              <w:t>에이전트 사용이 토큰을 10배에서 15배, 20배로</w:t>
             </w:r>
           </w:p>
         </w:tc>
@@ -2968,98 +3754,6 @@
           <w:tcPr>
             <w:tcW w:type="dxa" w:w="4195"/>
             <w:shd w:val="clear" w:color="auto" w:fill="FFFFFF"/>
-            <w:tcMar>
-              <w:top w:w="60" w:type="dxa"/>
-              <w:left w:w="80" w:type="dxa"/>
-              <w:bottom w:w="60" w:type="dxa"/>
-              <w:right w:w="80" w:type="dxa"/>
-            </w:tcMar>
-          </w:tcPr>
-          <w:p>
-            <w:pPr>
-              <w:spacing w:before="0" w:after="0" w:line="269" w:lineRule="auto"/>
-              <w:jc w:val="center"/>
-            </w:pPr>
-            <w:r/>
-            <w:r>
-              <w:rPr>
-                <w:rFonts w:ascii="맑은 고딕" w:hAnsi="맑은 고딕" w:eastAsia="맑은 고딕"/>
-                <w:b w:val="0"/>
-                <w:i w:val="0"/>
-                <w:color w:val="1A1A1A"/>
-                <w:sz w:val="19"/>
-              </w:rPr>
-              <w:t>니어라인 계약이 깨지거나 증설이 앞당겨진다</w:t>
-            </w:r>
-          </w:p>
-        </w:tc>
-      </w:tr>
-      <w:tr>
-        <w:trPr>
-          <w:cantSplit/>
-        </w:trPr>
-        <w:tc>
-          <w:tcPr>
-            <w:tcW w:type="dxa" w:w="1587"/>
-            <w:shd w:val="clear" w:color="auto" w:fill="F7F9FC"/>
-            <w:tcMar>
-              <w:top w:w="60" w:type="dxa"/>
-              <w:left w:w="80" w:type="dxa"/>
-              <w:bottom w:w="60" w:type="dxa"/>
-              <w:right w:w="80" w:type="dxa"/>
-            </w:tcMar>
-          </w:tcPr>
-          <w:p>
-            <w:pPr>
-              <w:spacing w:before="0" w:after="0" w:line="269" w:lineRule="auto"/>
-              <w:jc w:val="left"/>
-            </w:pPr>
-            <w:r/>
-            <w:r>
-              <w:rPr>
-                <w:rFonts w:ascii="맑은 고딕" w:hAnsi="맑은 고딕" w:eastAsia="맑은 고딕"/>
-                <w:b/>
-                <w:i w:val="0"/>
-                <w:color w:val="1A1A1A"/>
-                <w:sz w:val="19"/>
-              </w:rPr>
-              <w:t>수요 온도</w:t>
-            </w:r>
-          </w:p>
-        </w:tc>
-        <w:tc>
-          <w:tcPr>
-            <w:tcW w:type="dxa" w:w="4195"/>
-            <w:shd w:val="clear" w:color="auto" w:fill="F7F9FC"/>
-            <w:tcMar>
-              <w:top w:w="60" w:type="dxa"/>
-              <w:left w:w="80" w:type="dxa"/>
-              <w:bottom w:w="60" w:type="dxa"/>
-              <w:right w:w="80" w:type="dxa"/>
-            </w:tcMar>
-          </w:tcPr>
-          <w:p>
-            <w:pPr>
-              <w:spacing w:before="0" w:after="0" w:line="269" w:lineRule="auto"/>
-              <w:jc w:val="center"/>
-            </w:pPr>
-            <w:r/>
-            <w:r>
-              <w:rPr>
-                <w:rFonts w:ascii="맑은 고딕" w:hAnsi="맑은 고딕" w:eastAsia="맑은 고딕"/>
-                <w:b w:val="0"/>
-                <w:i w:val="0"/>
-                <w:color w:val="1A1A1A"/>
-                <w:sz w:val="19"/>
-              </w:rPr>
-              <w:t>에이전트 사용이 토큰을 10배에서 15배, 20배로</w:t>
-            </w:r>
-          </w:p>
-        </w:tc>
-        <w:tc>
-          <w:tcPr>
-            <w:tcW w:type="dxa" w:w="4195"/>
-            <w:shd w:val="clear" w:color="auto" w:fill="F7F9FC"/>
             <w:tcMar>
               <w:top w:w="60" w:type="dxa"/>
               <w:left w:w="80" w:type="dxa"/>
@@ -3123,7 +3817,7 @@
           <w:color w:val="B8943A"/>
           <w:sz w:val="32"/>
         </w:rPr>
-        <w:t xml:space="preserve">6.  </w:t>
+        <w:t xml:space="preserve">8.  </w:t>
       </w:r>
       <w:r>
         <w:rPr>
@@ -3192,7 +3886,7 @@
                 <w:color w:val="1A1A1A"/>
                 <w:sz w:val="21"/>
               </w:rPr>
-              <w:t>천장은 10년물 5%대다. 고용 둔화는 장을 받치되, 지수 전체를 한 단 더 올리지 않는다.</w:t>
+              <w:t>천장은 10년물 5.3%대다. 10월 5일에도 나스닥은 그 위에서 사상 최고였다. 다음 검증은 3분기 실적이다.</w:t>
             </w:r>
           </w:p>
           <w:p>
@@ -3207,7 +3901,7 @@
                 <w:color w:val="1A1A1A"/>
                 <w:sz w:val="21"/>
               </w:rPr>
-              <w:t>돈은 GPU 다음으로 간다. 메모리, 기판, 광, 전력이 한 체인이다.</w:t>
+              <w:t>전력은 수요의 끝이 아니다. 데이터센터의 속도이고, 가장 빨리 메가와트를 붙이는 전원이 1차 해법이다.</w:t>
             </w:r>
           </w:p>
           <w:p>
@@ -3222,7 +3916,7 @@
                 <w:color w:val="1A1A1A"/>
                 <w:sz w:val="21"/>
               </w:rPr>
-              <w:t>메모리 가격은 122까지 갔다가 90으로 온다. 이익의 기본은 분기 60~75조이고, 주가 224만원은 그 이익에 8배를 줄 때다.</w:t>
+              <w:t>돈은 그 속도 뒤에서 메모리, 기판, 광으로 간다. 하이닉스 224만원은 28년 이익에 8배를 줄 때다.</w:t>
             </w:r>
           </w:p>
           <w:p>
@@ -3237,7 +3931,7 @@
                 <w:color w:val="1A1A1A"/>
                 <w:sz w:val="21"/>
               </w:rPr>
-              <w:t>HDD의 −10%와 두산의 급락과 앤트로픽 2조는 이 체인의 같은 문장이 아니다.</w:t>
+              <w:t>한국은 연휴 갭을 코스닥이 메웠다. 대형주는 유지하고, 하루의 바스켓으로 갈아타지 않는다.</w:t>
             </w:r>
           </w:p>
         </w:tc>
@@ -3266,7 +3960,7 @@
           <w:color w:val="4B5563"/>
           <w:sz w:val="19"/>
         </w:rPr>
-        <w:t>— 10월 2일 큰 흐름. 세부 등식은 검증 노트, 종목별 녹음은 강의노트.</w:t>
+        <w:t>— 10월 2일 흐름에 10월 5일 미국장, 전력 병목, 연휴 직후 방송을 얹었다. 세부 등식은 검증 노트.</w:t>
       </w:r>
     </w:p>
     <w:sectPr>
@@ -3327,7 +4021,7 @@
         <w:color w:val="4B5563"/>
         <w:sz w:val="17"/>
       </w:rPr>
-      <w:t>10/2 큰 흐름  ·  금리 천장 · AI 체인 · 피크 이후</w:t>
+      <w:t>10/2–10/6 큰 흐름  ·  금리 · 전력 · AI 체인</w:t>
     </w:r>
   </w:p>
 </w:hdr>

</xml_diff>